<commit_message>
Fix Template Bismillah Final
</commit_message>
<xml_diff>
--- a/public/templates/BERKAS PEMBAYARAN PPL TERMIN II - 1 BULAN (1).docx
+++ b/public/templates/BERKAS PEMBAYARAN PPL TERMIN II - 1 BULAN (1).docx
@@ -135,7 +135,27 @@
           <w:szCs w:val="24"/>
           <w:lang w:val="sv-SE"/>
         </w:rPr>
-        <w:t>{nomor-prefix}</w:t>
+        <w:t>{nomor</w:t>
+      </w:r>
+      <w:r>
+        <w:rPr>
+          <w:rFonts w:ascii="Bookman Old Style" w:eastAsia="Bookman Old Style" w:hAnsi="Bookman Old Style" w:cs="Bookman Old Style"/>
+          <w:color w:val="000000"/>
+          <w:sz w:val="24"/>
+          <w:szCs w:val="24"/>
+          <w:lang w:val="sv-SE"/>
+        </w:rPr>
+        <w:t>_</w:t>
+      </w:r>
+      <w:r>
+        <w:rPr>
+          <w:rFonts w:ascii="Bookman Old Style" w:eastAsia="Bookman Old Style" w:hAnsi="Bookman Old Style" w:cs="Bookman Old Style"/>
+          <w:color w:val="000000"/>
+          <w:sz w:val="24"/>
+          <w:szCs w:val="24"/>
+          <w:lang w:val="sv-SE"/>
+        </w:rPr>
+        <w:t>prefix}</w:t>
       </w:r>
       <w:r>
         <w:rPr>
@@ -1138,6 +1158,15 @@
                 <w:szCs w:val="24"/>
                 <w:lang w:val="sv-SE"/>
               </w:rPr>
+              <w:t xml:space="preserve"> </w:t>
+            </w:r>
+            <w:r>
+              <w:rPr>
+                <w:rFonts w:ascii="Bookman Old Style" w:eastAsia="Bookman Old Style" w:hAnsi="Bookman Old Style" w:cs="Bookman Old Style"/>
+                <w:sz w:val="24"/>
+                <w:szCs w:val="24"/>
+                <w:lang w:val="sv-SE"/>
+              </w:rPr>
               <w:t>{bulan_terbilang}</w:t>
             </w:r>
             <w:r>
@@ -4540,6 +4569,16 @@
           <w:szCs w:val="24"/>
         </w:rPr>
         <w:t>}</w:t>
+      </w:r>
+      <w:r>
+        <w:rPr>
+          <w:rFonts w:ascii="Bookman Old Style" w:eastAsia="Bookman Old Style" w:hAnsi="Bookman Old Style" w:cs="Bookman Old Style"/>
+          <w:color w:val="000000"/>
+          <w:sz w:val="24"/>
+          <w:szCs w:val="24"/>
+          <w:lang w:val="sv-SE"/>
+        </w:rPr>
+        <w:t>/BAPP-SE2026/PPL/3172/SS.330/2026</w:t>
       </w:r>
     </w:p>
     <w:p>
@@ -7070,7 +7109,25 @@
           <w:szCs w:val="24"/>
           <w:lang w:val="sv-SE"/>
         </w:rPr>
-        <w:t>{hari}</w:t>
+        <w:t>{</w:t>
+      </w:r>
+      <w:r>
+        <w:rPr>
+          <w:rFonts w:ascii="Bookman Old Style" w:eastAsia="Bookman Old Style" w:hAnsi="Bookman Old Style" w:cs="Bookman Old Style"/>
+          <w:sz w:val="24"/>
+          <w:szCs w:val="24"/>
+          <w:lang w:val="sv-SE"/>
+        </w:rPr>
+        <w:t>tanggal</w:t>
+      </w:r>
+      <w:r>
+        <w:rPr>
+          <w:rFonts w:ascii="Bookman Old Style" w:eastAsia="Bookman Old Style" w:hAnsi="Bookman Old Style" w:cs="Bookman Old Style"/>
+          <w:sz w:val="24"/>
+          <w:szCs w:val="24"/>
+          <w:lang w:val="sv-SE"/>
+        </w:rPr>
+        <w:t>}</w:t>
       </w:r>
       <w:r>
         <w:rPr>
@@ -10613,6 +10670,15 @@
           <w:lang w:val="sv-SE"/>
         </w:rPr>
         <w:t>{nomor_prefix}</w:t>
+      </w:r>
+      <w:r>
+        <w:rPr>
+          <w:rFonts w:ascii="Bookman Old Style" w:eastAsia="Bookman Old Style" w:hAnsi="Bookman Old Style" w:cs="Bookman Old Style"/>
+          <w:sz w:val="24"/>
+          <w:szCs w:val="24"/>
+          <w:lang w:val="sv-SE"/>
+        </w:rPr>
+        <w:t>/BAST-SE2026/PPL/3172/SS.330/2026</w:t>
       </w:r>
     </w:p>
     <w:p>
@@ -16034,28 +16100,28 @@
 </file>
 
 <file path=customXml/item1.xml><?xml version="1.0" encoding="utf-8"?>
-<b:Sources xmlns:b="http://schemas.openxmlformats.org/officeDocument/2006/bibliography" xmlns="http://schemas.openxmlformats.org/officeDocument/2006/bibliography" SelectedStyle="\APASixthEditionOfficeOnline.xsl" StyleName="APA" Version="6"/>
-</file>
-
-<file path=customXml/item2.xml><?xml version="1.0" encoding="utf-8"?>
 <go:gDocsCustomXmlDataStorage xmlns:go="http://customooxmlschemas.google.com/" xmlns:r="http://schemas.openxmlformats.org/officeDocument/2006/relationships" uri="GoogleDocsCustomDataVersion2">
   <go:docsCustomData xmlns:go="http://customooxmlschemas.google.com/" roundtripDataSignature="AMtx7mgT2azPrqp/IgDHUBjGtjdpBaNHXw==">CgMxLjA4AHIhMWtrdG1oNHFQNm5TQUpqUlIxRDRZdVc0QlJjNVluYTZB</go:docsCustomData>
 </go:gDocsCustomXmlDataStorage>
 </file>
 
-<file path=customXml/itemProps1.xml><?xml version="1.0" encoding="utf-8"?>
-<ds:datastoreItem xmlns:ds="http://schemas.openxmlformats.org/officeDocument/2006/customXml" ds:itemID="{FD6A71ED-218F-4912-9D16-521B75DE186A}">
-  <ds:schemaRefs>
-    <ds:schemaRef ds:uri="http://schemas.openxmlformats.org/officeDocument/2006/bibliography"/>
-  </ds:schemaRefs>
-</ds:datastoreItem>
+<file path=customXml/item2.xml><?xml version="1.0" encoding="utf-8"?>
+<b:Sources xmlns:b="http://schemas.openxmlformats.org/officeDocument/2006/bibliography" xmlns="http://schemas.openxmlformats.org/officeDocument/2006/bibliography" SelectedStyle="\APASixthEditionOfficeOnline.xsl" StyleName="APA" Version="6"/>
 </file>
 
-<file path=customXml/itemProps2.xml><?xml version="1.0" encoding="utf-8"?>
+<file path=customXml/itemProps1.xml><?xml version="1.0" encoding="utf-8"?>
 <ds:datastoreItem xmlns:ds="http://schemas.openxmlformats.org/officeDocument/2006/customXml" ds:itemID="{11111111-1234-1234-1234-123412341234}">
   <ds:schemaRefs>
     <ds:schemaRef ds:uri="http://customooxmlschemas.google.com/"/>
     <ds:schemaRef ds:uri="http://schemas.openxmlformats.org/officeDocument/2006/relationships"/>
   </ds:schemaRefs>
 </ds:datastoreItem>
+</file>
+
+<file path=customXml/itemProps2.xml><?xml version="1.0" encoding="utf-8"?>
+<ds:datastoreItem xmlns:ds="http://schemas.openxmlformats.org/officeDocument/2006/customXml" ds:itemID="{FD6A71ED-218F-4912-9D16-521B75DE186A}">
+  <ds:schemaRefs>
+    <ds:schemaRef ds:uri="http://schemas.openxmlformats.org/officeDocument/2006/bibliography"/>
+  </ds:schemaRefs>
+</ds:datastoreItem>
 </file>
</xml_diff>